<commit_message>
Updated the term project code review form and DevEnv rubric
</commit_message>
<xml_diff>
--- a/Labs/TermProject/CodeReviewForm-TermProject.docx
+++ b/Labs/TermProject/CodeReviewForm-TermProject.docx
@@ -396,15 +396,7 @@
               <w:spacing w:after="0" w:line="240" w:lineRule="auto"/>
             </w:pPr>
             <w:r>
-              <w:t xml:space="preserve">Is </w:t>
-            </w:r>
-            <w:proofErr w:type="gramStart"/>
-            <w:r>
-              <w:t>all of</w:t>
-            </w:r>
-            <w:proofErr w:type="gramEnd"/>
-            <w:r>
-              <w:t xml:space="preserve"> the code in a GitHub repository?</w:t>
+              <w:t>Is all of the code in a GitHub repository?</w:t>
             </w:r>
           </w:p>
         </w:tc>
@@ -741,7 +733,13 @@
             </w:r>
             <w:proofErr w:type="spellEnd"/>
             <w:r>
-              <w:t xml:space="preserve"> and webpack used to manage packages and bundle the web app?</w:t>
+              <w:t xml:space="preserve"> and </w:t>
+            </w:r>
+            <w:r>
+              <w:t>Vite</w:t>
+            </w:r>
+            <w:r>
+              <w:t xml:space="preserve"> used to manage packages and bundle the web app?</w:t>
             </w:r>
           </w:p>
         </w:tc>
@@ -1104,7 +1102,7 @@
               <w:t xml:space="preserve">warnings produced when bundling or running </w:t>
             </w:r>
             <w:r>
-              <w:t>webpack</w:t>
+              <w:t>the Vite</w:t>
             </w:r>
             <w:r>
               <w:t xml:space="preserve"> dev server?</w:t>
@@ -1357,6 +1355,78 @@
             </w:pPr>
             <w:r>
               <w:t>Is at least one web API called using the fetch API?</w:t>
+            </w:r>
+          </w:p>
+        </w:tc>
+        <w:tc>
+          <w:tcPr>
+            <w:tcW w:w="720" w:type="dxa"/>
+            <w:tcBorders>
+              <w:top w:val="single" w:sz="4" w:space="0" w:color="000000"/>
+              <w:left w:val="single" w:sz="4" w:space="0" w:color="000000"/>
+              <w:bottom w:val="single" w:sz="4" w:space="0" w:color="000000"/>
+              <w:right w:val="single" w:sz="4" w:space="0" w:color="000000"/>
+            </w:tcBorders>
+          </w:tcPr>
+          <w:p>
+            <w:pPr>
+              <w:widowControl w:val="0"/>
+              <w:autoSpaceDE w:val="0"/>
+              <w:snapToGrid w:val="0"/>
+              <w:spacing w:after="0" w:line="240" w:lineRule="auto"/>
+            </w:pPr>
+          </w:p>
+        </w:tc>
+        <w:tc>
+          <w:tcPr>
+            <w:tcW w:w="810" w:type="dxa"/>
+            <w:tcBorders>
+              <w:top w:val="single" w:sz="4" w:space="0" w:color="000000"/>
+              <w:left w:val="single" w:sz="4" w:space="0" w:color="000000"/>
+              <w:bottom w:val="single" w:sz="4" w:space="0" w:color="000000"/>
+              <w:right w:val="single" w:sz="4" w:space="0" w:color="000000"/>
+            </w:tcBorders>
+          </w:tcPr>
+          <w:p>
+            <w:pPr>
+              <w:widowControl w:val="0"/>
+              <w:autoSpaceDE w:val="0"/>
+              <w:snapToGrid w:val="0"/>
+              <w:spacing w:after="0" w:line="240" w:lineRule="auto"/>
+            </w:pPr>
+          </w:p>
+        </w:tc>
+      </w:tr>
+      <w:tr>
+        <w:tc>
+          <w:tcPr>
+            <w:tcW w:w="8190" w:type="dxa"/>
+            <w:tcBorders>
+              <w:top w:val="single" w:sz="4" w:space="0" w:color="000000"/>
+              <w:left w:val="single" w:sz="4" w:space="0" w:color="000000"/>
+              <w:bottom w:val="single" w:sz="4" w:space="0" w:color="000000"/>
+            </w:tcBorders>
+          </w:tcPr>
+          <w:p>
+            <w:pPr>
+              <w:widowControl w:val="0"/>
+              <w:tabs>
+                <w:tab w:val="left" w:pos="1454"/>
+              </w:tabs>
+              <w:autoSpaceDE w:val="0"/>
+              <w:snapToGrid w:val="0"/>
+              <w:spacing w:after="0" w:line="240" w:lineRule="auto"/>
+            </w:pPr>
+            <w:r>
+              <w:t xml:space="preserve">Is there at least on </w:t>
+            </w:r>
+            <w:proofErr w:type="spellStart"/>
+            <w:r>
+              <w:t>Vitest</w:t>
+            </w:r>
+            <w:proofErr w:type="spellEnd"/>
+            <w:r>
+              <w:t xml:space="preserve"> unit test?</w:t>
             </w:r>
           </w:p>
         </w:tc>
@@ -1570,13 +1640,7 @@
               <w:t xml:space="preserve"> </w:t>
             </w:r>
             <w:r>
-              <w:t xml:space="preserve">chart.js, </w:t>
-            </w:r>
-            <w:r>
-              <w:t>a</w:t>
-            </w:r>
-            <w:r>
-              <w:t xml:space="preserve"> map API</w:t>
+              <w:t>a proxy server</w:t>
             </w:r>
             <w:r>
               <w:t>, etc.) List it/them below:</w:t>
@@ -2173,7 +2237,6 @@
         <w:spacing w:after="0" w:line="240" w:lineRule="auto"/>
       </w:pPr>
       <w:r>
-        <w:lastRenderedPageBreak/>
         <w:t>(Review style and best practices on the next page)</w:t>
       </w:r>
     </w:p>
@@ -3109,8 +3172,12 @@
       </w:r>
     </w:p>
     <w:sectPr>
-      <w:headerReference w:type="default" r:id="rId8"/>
-      <w:footerReference w:type="default" r:id="rId9"/>
+      <w:headerReference w:type="even" r:id="rId8"/>
+      <w:headerReference w:type="default" r:id="rId9"/>
+      <w:footerReference w:type="even" r:id="rId10"/>
+      <w:footerReference w:type="default" r:id="rId11"/>
+      <w:headerReference w:type="first" r:id="rId12"/>
+      <w:footerReference w:type="first" r:id="rId13"/>
       <w:pgSz w:w="12240" w:h="15840"/>
       <w:pgMar w:top="1440" w:right="1440" w:bottom="1440" w:left="1440" w:header="720" w:footer="720" w:gutter="0"/>
       <w:cols w:space="720"/>
@@ -3151,12 +3218,38 @@
     <w:pPr>
       <w:pStyle w:val="Footer"/>
     </w:pPr>
+  </w:p>
+</w:ftr>
+</file>
+
+<file path=word/footer2.xml><?xml version="1.0" encoding="utf-8"?>
+<w:ftr xmlns:wpc="http://schemas.microsoft.com/office/word/2010/wordprocessingCanvas" xmlns:cx="http://schemas.microsoft.com/office/drawing/2014/chartex" xmlns:cx1="http://schemas.microsoft.com/office/drawing/2015/9/8/chartex" xmlns:cx2="http://schemas.microsoft.com/office/drawing/2015/10/21/chartex" xmlns:cx3="http://schemas.microsoft.com/office/drawing/2016/5/9/chartex" xmlns:cx4="http://schemas.microsoft.com/office/drawing/2016/5/10/chartex" xmlns:cx5="http://schemas.microsoft.com/office/drawing/2016/5/11/chartex" xmlns:cx6="http://schemas.microsoft.com/office/drawing/2016/5/12/chartex" xmlns:cx7="http://schemas.microsoft.com/office/drawing/2016/5/13/chartex" xmlns:cx8="http://schemas.microsoft.com/office/drawing/2016/5/14/chartex" xmlns:mc="http://schemas.openxmlformats.org/markup-compatibility/2006" xmlns:aink="http://schemas.microsoft.com/office/drawing/2016/ink" xmlns:am3d="http://schemas.microsoft.com/office/drawing/2017/model3d" xmlns:o="urn:schemas-microsoft-com:office:office" xmlns:oel="http://schemas.microsoft.com/office/2019/extlst" xmlns:r="http://schemas.openxmlformats.org/officeDocument/2006/relationships" xmlns:m="http://schemas.openxmlformats.org/officeDocument/2006/math" xmlns:v="urn:schemas-microsoft-com:vml" xmlns:wp14="http://schemas.microsoft.com/office/word/2010/wordprocessingDrawing" xmlns:wp="http://schemas.openxmlformats.org/drawingml/2006/wordprocessingDrawing" xmlns:w10="urn:schemas-microsoft-com:office:word" xmlns:w="http://schemas.openxmlformats.org/wordprocessingml/2006/main" xmlns:w14="http://schemas.microsoft.com/office/word/2010/wordml" xmlns:w15="http://schemas.microsoft.com/office/word/2012/wordml" xmlns:w16cex="http://schemas.microsoft.com/office/word/2018/wordml/cex" xmlns:w16cid="http://schemas.microsoft.com/office/word/2016/wordml/cid" xmlns:w16="http://schemas.microsoft.com/office/word/2018/wordml" xmlns:w16du="http://schemas.microsoft.com/office/word/2023/wordml/word16du" xmlns:w16sdtdh="http://schemas.microsoft.com/office/word/2020/wordml/sdtdatahash" xmlns:w16sdtfl="http://schemas.microsoft.com/office/word/2024/wordml/sdtformatlock" xmlns:w16se="http://schemas.microsoft.com/office/word/2015/wordml/symex" xmlns:wpg="http://schemas.microsoft.com/office/word/2010/wordprocessingGroup" xmlns:wpi="http://schemas.microsoft.com/office/word/2010/wordprocessingInk" xmlns:wne="http://schemas.microsoft.com/office/word/2006/wordml" xmlns:wps="http://schemas.microsoft.com/office/word/2010/wordprocessingShape" mc:Ignorable="w14 w15 w16se w16cid w16 w16cex w16sdtdh w16sdtfl w16du wp14">
+  <w:p>
+    <w:pPr>
+      <w:pStyle w:val="Footer"/>
+    </w:pPr>
     <w:r>
       <w:t xml:space="preserve">Developed by Brian Bird, Lane Community College, Spring 2015, Revised </w:t>
     </w:r>
     <w:r>
-      <w:t>Spring 2025</w:t>
+      <w:t xml:space="preserve">Spring </w:t>
     </w:r>
+    <w:r>
+      <w:t>202</w:t>
+    </w:r>
+    <w:r>
+      <w:t>6</w:t>
+    </w:r>
+  </w:p>
+</w:ftr>
+</file>
+
+<file path=word/footer3.xml><?xml version="1.0" encoding="utf-8"?>
+<w:ftr xmlns:wpc="http://schemas.microsoft.com/office/word/2010/wordprocessingCanvas" xmlns:cx="http://schemas.microsoft.com/office/drawing/2014/chartex" xmlns:cx1="http://schemas.microsoft.com/office/drawing/2015/9/8/chartex" xmlns:cx2="http://schemas.microsoft.com/office/drawing/2015/10/21/chartex" xmlns:cx3="http://schemas.microsoft.com/office/drawing/2016/5/9/chartex" xmlns:cx4="http://schemas.microsoft.com/office/drawing/2016/5/10/chartex" xmlns:cx5="http://schemas.microsoft.com/office/drawing/2016/5/11/chartex" xmlns:cx6="http://schemas.microsoft.com/office/drawing/2016/5/12/chartex" xmlns:cx7="http://schemas.microsoft.com/office/drawing/2016/5/13/chartex" xmlns:cx8="http://schemas.microsoft.com/office/drawing/2016/5/14/chartex" xmlns:mc="http://schemas.openxmlformats.org/markup-compatibility/2006" xmlns:aink="http://schemas.microsoft.com/office/drawing/2016/ink" xmlns:am3d="http://schemas.microsoft.com/office/drawing/2017/model3d" xmlns:o="urn:schemas-microsoft-com:office:office" xmlns:oel="http://schemas.microsoft.com/office/2019/extlst" xmlns:r="http://schemas.openxmlformats.org/officeDocument/2006/relationships" xmlns:m="http://schemas.openxmlformats.org/officeDocument/2006/math" xmlns:v="urn:schemas-microsoft-com:vml" xmlns:wp14="http://schemas.microsoft.com/office/word/2010/wordprocessingDrawing" xmlns:wp="http://schemas.openxmlformats.org/drawingml/2006/wordprocessingDrawing" xmlns:w10="urn:schemas-microsoft-com:office:word" xmlns:w="http://schemas.openxmlformats.org/wordprocessingml/2006/main" xmlns:w14="http://schemas.microsoft.com/office/word/2010/wordml" xmlns:w15="http://schemas.microsoft.com/office/word/2012/wordml" xmlns:w16cex="http://schemas.microsoft.com/office/word/2018/wordml/cex" xmlns:w16cid="http://schemas.microsoft.com/office/word/2016/wordml/cid" xmlns:w16="http://schemas.microsoft.com/office/word/2018/wordml" xmlns:w16du="http://schemas.microsoft.com/office/word/2023/wordml/word16du" xmlns:w16sdtdh="http://schemas.microsoft.com/office/word/2020/wordml/sdtdatahash" xmlns:w16sdtfl="http://schemas.microsoft.com/office/word/2024/wordml/sdtformatlock" xmlns:w16se="http://schemas.microsoft.com/office/word/2015/wordml/symex" xmlns:wpg="http://schemas.microsoft.com/office/word/2010/wordprocessingGroup" xmlns:wpi="http://schemas.microsoft.com/office/word/2010/wordprocessingInk" xmlns:wne="http://schemas.microsoft.com/office/word/2006/wordml" xmlns:wps="http://schemas.microsoft.com/office/word/2010/wordprocessingShape" mc:Ignorable="w14 w15 w16se w16cid w16 w16cex w16sdtdh w16sdtfl w16du wp14">
+  <w:p>
+    <w:pPr>
+      <w:pStyle w:val="Footer"/>
+    </w:pPr>
   </w:p>
 </w:ftr>
 </file>
@@ -3191,6 +3284,16 @@
   <w:p>
     <w:pPr>
       <w:pStyle w:val="Header"/>
+    </w:pPr>
+  </w:p>
+</w:hdr>
+</file>
+
+<file path=word/header2.xml><?xml version="1.0" encoding="utf-8"?>
+<w:hdr xmlns:wpc="http://schemas.microsoft.com/office/word/2010/wordprocessingCanvas" xmlns:cx="http://schemas.microsoft.com/office/drawing/2014/chartex" xmlns:cx1="http://schemas.microsoft.com/office/drawing/2015/9/8/chartex" xmlns:cx2="http://schemas.microsoft.com/office/drawing/2015/10/21/chartex" xmlns:cx3="http://schemas.microsoft.com/office/drawing/2016/5/9/chartex" xmlns:cx4="http://schemas.microsoft.com/office/drawing/2016/5/10/chartex" xmlns:cx5="http://schemas.microsoft.com/office/drawing/2016/5/11/chartex" xmlns:cx6="http://schemas.microsoft.com/office/drawing/2016/5/12/chartex" xmlns:cx7="http://schemas.microsoft.com/office/drawing/2016/5/13/chartex" xmlns:cx8="http://schemas.microsoft.com/office/drawing/2016/5/14/chartex" xmlns:mc="http://schemas.openxmlformats.org/markup-compatibility/2006" xmlns:aink="http://schemas.microsoft.com/office/drawing/2016/ink" xmlns:am3d="http://schemas.microsoft.com/office/drawing/2017/model3d" xmlns:o="urn:schemas-microsoft-com:office:office" xmlns:oel="http://schemas.microsoft.com/office/2019/extlst" xmlns:r="http://schemas.openxmlformats.org/officeDocument/2006/relationships" xmlns:m="http://schemas.openxmlformats.org/officeDocument/2006/math" xmlns:v="urn:schemas-microsoft-com:vml" xmlns:wp14="http://schemas.microsoft.com/office/word/2010/wordprocessingDrawing" xmlns:wp="http://schemas.openxmlformats.org/drawingml/2006/wordprocessingDrawing" xmlns:w10="urn:schemas-microsoft-com:office:word" xmlns:w="http://schemas.openxmlformats.org/wordprocessingml/2006/main" xmlns:w14="http://schemas.microsoft.com/office/word/2010/wordml" xmlns:w15="http://schemas.microsoft.com/office/word/2012/wordml" xmlns:w16cex="http://schemas.microsoft.com/office/word/2018/wordml/cex" xmlns:w16cid="http://schemas.microsoft.com/office/word/2016/wordml/cid" xmlns:w16="http://schemas.microsoft.com/office/word/2018/wordml" xmlns:w16du="http://schemas.microsoft.com/office/word/2023/wordml/word16du" xmlns:w16sdtdh="http://schemas.microsoft.com/office/word/2020/wordml/sdtdatahash" xmlns:w16sdtfl="http://schemas.microsoft.com/office/word/2024/wordml/sdtformatlock" xmlns:w16se="http://schemas.microsoft.com/office/word/2015/wordml/symex" xmlns:wpg="http://schemas.microsoft.com/office/word/2010/wordprocessingGroup" xmlns:wpi="http://schemas.microsoft.com/office/word/2010/wordprocessingInk" xmlns:wne="http://schemas.microsoft.com/office/word/2006/wordml" xmlns:wps="http://schemas.microsoft.com/office/word/2010/wordprocessingShape" mc:Ignorable="w14 w15 w16se w16cid w16 w16cex w16sdtdh w16sdtfl w16du wp14">
+  <w:p>
+    <w:pPr>
+      <w:pStyle w:val="Header"/>
       <w:rPr>
         <w:sz w:val="28"/>
       </w:rPr>
@@ -3222,6 +3325,16 @@
       </w:rPr>
       <w:t>Code Review Form</w:t>
     </w:r>
+  </w:p>
+</w:hdr>
+</file>
+
+<file path=word/header3.xml><?xml version="1.0" encoding="utf-8"?>
+<w:hdr xmlns:wpc="http://schemas.microsoft.com/office/word/2010/wordprocessingCanvas" xmlns:cx="http://schemas.microsoft.com/office/drawing/2014/chartex" xmlns:cx1="http://schemas.microsoft.com/office/drawing/2015/9/8/chartex" xmlns:cx2="http://schemas.microsoft.com/office/drawing/2015/10/21/chartex" xmlns:cx3="http://schemas.microsoft.com/office/drawing/2016/5/9/chartex" xmlns:cx4="http://schemas.microsoft.com/office/drawing/2016/5/10/chartex" xmlns:cx5="http://schemas.microsoft.com/office/drawing/2016/5/11/chartex" xmlns:cx6="http://schemas.microsoft.com/office/drawing/2016/5/12/chartex" xmlns:cx7="http://schemas.microsoft.com/office/drawing/2016/5/13/chartex" xmlns:cx8="http://schemas.microsoft.com/office/drawing/2016/5/14/chartex" xmlns:mc="http://schemas.openxmlformats.org/markup-compatibility/2006" xmlns:aink="http://schemas.microsoft.com/office/drawing/2016/ink" xmlns:am3d="http://schemas.microsoft.com/office/drawing/2017/model3d" xmlns:o="urn:schemas-microsoft-com:office:office" xmlns:oel="http://schemas.microsoft.com/office/2019/extlst" xmlns:r="http://schemas.openxmlformats.org/officeDocument/2006/relationships" xmlns:m="http://schemas.openxmlformats.org/officeDocument/2006/math" xmlns:v="urn:schemas-microsoft-com:vml" xmlns:wp14="http://schemas.microsoft.com/office/word/2010/wordprocessingDrawing" xmlns:wp="http://schemas.openxmlformats.org/drawingml/2006/wordprocessingDrawing" xmlns:w10="urn:schemas-microsoft-com:office:word" xmlns:w="http://schemas.openxmlformats.org/wordprocessingml/2006/main" xmlns:w14="http://schemas.microsoft.com/office/word/2010/wordml" xmlns:w15="http://schemas.microsoft.com/office/word/2012/wordml" xmlns:w16cex="http://schemas.microsoft.com/office/word/2018/wordml/cex" xmlns:w16cid="http://schemas.microsoft.com/office/word/2016/wordml/cid" xmlns:w16="http://schemas.microsoft.com/office/word/2018/wordml" xmlns:w16du="http://schemas.microsoft.com/office/word/2023/wordml/word16du" xmlns:w16sdtdh="http://schemas.microsoft.com/office/word/2020/wordml/sdtdatahash" xmlns:w16sdtfl="http://schemas.microsoft.com/office/word/2024/wordml/sdtformatlock" xmlns:w16se="http://schemas.microsoft.com/office/word/2015/wordml/symex" xmlns:wpg="http://schemas.microsoft.com/office/word/2010/wordprocessingGroup" xmlns:wpi="http://schemas.microsoft.com/office/word/2010/wordprocessingInk" xmlns:wne="http://schemas.microsoft.com/office/word/2006/wordml" xmlns:wps="http://schemas.microsoft.com/office/word/2010/wordprocessingShape" mc:Ignorable="w14 w15 w16se w16cid w16 w16cex w16sdtdh w16sdtfl w16du wp14">
+  <w:p>
+    <w:pPr>
+      <w:pStyle w:val="Header"/>
+    </w:pPr>
   </w:p>
 </w:hdr>
 </file>

</xml_diff>

<commit_message>
Updates to the lab 7 rubric, term project rubric and code review
</commit_message>
<xml_diff>
--- a/Labs/TermProject/CodeReviewForm-TermProject.docx
+++ b/Labs/TermProject/CodeReviewForm-TermProject.docx
@@ -524,7 +524,13 @@
               <w:spacing w:after="0" w:line="240" w:lineRule="auto"/>
             </w:pPr>
             <w:r>
-              <w:t>Was Bootstrap or another CSS framework (not just CSS) used?</w:t>
+              <w:t>Was Bootstrap or another CSS framework used</w:t>
+            </w:r>
+            <w:r>
+              <w:t xml:space="preserve"> (optional)</w:t>
+            </w:r>
+            <w:r>
+              <w:t>?</w:t>
             </w:r>
           </w:p>
         </w:tc>
@@ -598,7 +604,13 @@
             </w:r>
             <w:proofErr w:type="gramEnd"/>
             <w:r>
-              <w:t xml:space="preserve"> framework) added as a package and bundled by webpack?</w:t>
+              <w:t xml:space="preserve"> framework) added as a package and bundled by </w:t>
+            </w:r>
+            <w:r>
+              <w:t>Vite</w:t>
+            </w:r>
+            <w:r>
+              <w:t>?</w:t>
             </w:r>
           </w:p>
         </w:tc>
@@ -1027,7 +1039,13 @@
               <w:spacing w:after="0" w:line="240" w:lineRule="auto"/>
             </w:pPr>
             <w:r>
-              <w:t xml:space="preserve">Does webpack.config.js only contain code for things needed for this project? </w:t>
+              <w:t xml:space="preserve">Does </w:t>
+            </w:r>
+            <w:r>
+              <w:t>vite</w:t>
+            </w:r>
+            <w:r>
+              <w:t xml:space="preserve">.config.js only contain code for things needed for this project? </w:t>
             </w:r>
           </w:p>
         </w:tc>
@@ -1093,19 +1111,65 @@
               <w:spacing w:after="0" w:line="240" w:lineRule="auto"/>
             </w:pPr>
             <w:r>
-              <w:t>Are errors</w:t>
-            </w:r>
-            <w:r>
-              <w:t>/</w:t>
-            </w:r>
-            <w:r>
-              <w:t xml:space="preserve">warnings produced when bundling or running </w:t>
-            </w:r>
-            <w:r>
-              <w:t>the Vite</w:t>
-            </w:r>
-            <w:r>
-              <w:t xml:space="preserve"> dev server?</w:t>
+              <w:t>W</w:t>
+            </w:r>
+            <w:r>
+              <w:t xml:space="preserve">hen </w:t>
+            </w:r>
+            <w:r>
+              <w:t xml:space="preserve">you execute </w:t>
+            </w:r>
+            <w:proofErr w:type="spellStart"/>
+            <w:r>
+              <w:rPr>
+                <w:i/>
+                <w:iCs/>
+              </w:rPr>
+              <w:t>npm</w:t>
+            </w:r>
+            <w:proofErr w:type="spellEnd"/>
+            <w:r>
+              <w:rPr>
+                <w:i/>
+                <w:iCs/>
+              </w:rPr>
+              <w:t xml:space="preserve"> run </w:t>
+            </w:r>
+            <w:r>
+              <w:rPr>
+                <w:i/>
+                <w:iCs/>
+              </w:rPr>
+              <w:t>bu</w:t>
+            </w:r>
+            <w:r>
+              <w:rPr>
+                <w:i/>
+                <w:iCs/>
+              </w:rPr>
+              <w:t>ild</w:t>
+            </w:r>
+            <w:r>
+              <w:t xml:space="preserve"> or </w:t>
+            </w:r>
+            <w:r>
+              <w:rPr>
+                <w:i/>
+                <w:iCs/>
+              </w:rPr>
+              <w:t>dev</w:t>
+            </w:r>
+            <w:r>
+              <w:t xml:space="preserve">, is the result free of </w:t>
+            </w:r>
+            <w:r>
+              <w:t>errors/warning</w:t>
+            </w:r>
+            <w:r>
+              <w:t>s</w:t>
+            </w:r>
+            <w:r>
+              <w:t>?</w:t>
             </w:r>
           </w:p>
         </w:tc>
@@ -2596,7 +2660,7 @@
               <w:spacing w:after="0" w:line="240" w:lineRule="auto"/>
             </w:pPr>
             <w:r>
-              <w:t xml:space="preserve">Do variable, function, and object property names use camelCase? </w:t>
+              <w:t xml:space="preserve">Do variable, function, and property names use camelCase? </w:t>
             </w:r>
           </w:p>
         </w:tc>
@@ -2667,7 +2731,25 @@
               <w:spacing w:after="0" w:line="240" w:lineRule="auto"/>
             </w:pPr>
             <w:r>
-              <w:t>Are any variables declared and not used?</w:t>
+              <w:t xml:space="preserve">Are </w:t>
+            </w:r>
+            <w:r>
+              <w:t>all</w:t>
+            </w:r>
+            <w:r>
+              <w:t xml:space="preserve"> variables </w:t>
+            </w:r>
+            <w:r>
+              <w:t xml:space="preserve">that are </w:t>
+            </w:r>
+            <w:r>
+              <w:t>declared used</w:t>
+            </w:r>
+            <w:r>
+              <w:t xml:space="preserve"> (no unused variables)</w:t>
+            </w:r>
+            <w:r>
+              <w:t>?</w:t>
             </w:r>
           </w:p>
         </w:tc>
@@ -2730,7 +2812,19 @@
               <w:spacing w:after="0" w:line="240" w:lineRule="auto"/>
             </w:pPr>
             <w:r>
-              <w:t>Have any unnecessary lines of code or files been removed?</w:t>
+              <w:t xml:space="preserve">Have </w:t>
+            </w:r>
+            <w:r>
+              <w:t>all</w:t>
+            </w:r>
+            <w:r>
+              <w:t xml:space="preserve"> unnecessary </w:t>
+            </w:r>
+            <w:r>
+              <w:t xml:space="preserve">or “dead” </w:t>
+            </w:r>
+            <w:r>
+              <w:t>lines of code or files been removed?</w:t>
             </w:r>
           </w:p>
         </w:tc>
@@ -3232,10 +3326,7 @@
       <w:t xml:space="preserve">Developed by Brian Bird, Lane Community College, Spring 2015, Revised </w:t>
     </w:r>
     <w:r>
-      <w:t xml:space="preserve">Spring </w:t>
-    </w:r>
-    <w:r>
-      <w:t>202</w:t>
+      <w:t>Spring 202</w:t>
     </w:r>
     <w:r>
       <w:t>6</w:t>

</xml_diff>